<commit_message>
feat: synchronize matrix storage with ClientStorage localStorage and support direct export on Vercel
</commit_message>
<xml_diff>
--- a/exports/qa-package/03_De_kiem_tra_KHTN8.docx
+++ b/exports/qa-package/03_De_kiem_tra_KHTN8.docx
@@ -355,7 +355,7 @@
           <w:sz w:val="20"/>
           <w:szCs w:val="20"/>
         </w:rPr>
-        <w:t xml:space="preserve">[Bối cảnh &amp; Dữ liệu: Bảng theo dõi các chỉ số sinh lí của học sinh Nam (14 tuổi) trong tiết Thể dục]</w:t>
+        <w:t xml:space="preserve">[Bối cảnh &amp; Dữ liệu: Áp suất tác dụng lên thợ lặn ở các độ sâu khác nhau (Khối lượng riêng nước biển d = 10300 N/m3)]</w:t>
       </w:r>
     </w:p>
     <w:p>
@@ -487,7 +487,7 @@
           <w:sz w:val="20"/>
           <w:szCs w:val="20"/>
         </w:rPr>
-        <w:t xml:space="preserve">[Bối cảnh &amp; Dữ liệu: Áp suất tác dụng lên thợ lặn ở các độ sâu khác nhau (Khối lượng riêng nước biển d = 10300 N/m3)]</w:t>
+        <w:t xml:space="preserve">[Bối cảnh &amp; Dữ liệu: Diễn biến độ mặn (gam muối / lít nước) tại trạm đo sông Hàm Luông theo các tháng mùa khô]</w:t>
       </w:r>
     </w:p>
     <w:p>
@@ -751,7 +751,7 @@
           <w:sz w:val="20"/>
           <w:szCs w:val="20"/>
         </w:rPr>
-        <w:t xml:space="preserve">[Bối cảnh &amp; Dữ liệu: Diễn biến độ mặn (gam muối / lít nước) tại trạm đo sông Hàm Luông theo các tháng mùa khô]</w:t>
+        <w:t xml:space="preserve">[Bối cảnh &amp; Dữ liệu: Áp suất tác dụng lên thợ lặn ở các độ sâu khác nhau (Khối lượng riêng nước biển d = 10300 N/m3)]</w:t>
       </w:r>
     </w:p>
     <w:p>
@@ -883,7 +883,7 @@
           <w:sz w:val="20"/>
           <w:szCs w:val="20"/>
         </w:rPr>
-        <w:t xml:space="preserve">[Bối cảnh &amp; Dữ liệu: Bảng theo dõi các chỉ số sinh lí của học sinh Nam (14 tuổi) trong tiết Thể dục]</w:t>
+        <w:t xml:space="preserve">[Bối cảnh &amp; Dữ liệu: Diễn biến độ mặn (gam muối / lít nước) tại trạm đo sông Hàm Luông theo các tháng mùa khô]</w:t>
       </w:r>
     </w:p>
     <w:p>
@@ -1015,7 +1015,7 @@
           <w:sz w:val="20"/>
           <w:szCs w:val="20"/>
         </w:rPr>
-        <w:t xml:space="preserve">[Bối cảnh &amp; Dữ liệu: Áp suất tác dụng lên thợ lặn ở các độ sâu khác nhau (Khối lượng riêng nước biển d = 10300 N/m3)]</w:t>
+        <w:t xml:space="preserve">[Bối cảnh &amp; Dữ liệu: Bảng theo dõi các chỉ số sinh lí của học sinh Nam (14 tuổi) trong tiết Thể dục]</w:t>
       </w:r>
     </w:p>
     <w:p>
@@ -1867,7 +1867,7 @@
           <w:sz w:val="20"/>
           <w:szCs w:val="20"/>
         </w:rPr>
-        <w:t xml:space="preserve">[Bối cảnh &amp; Dữ liệu: Diễn biến độ mặn (gam muối / lít nước) tại trạm đo sông Hàm Luông theo các tháng mùa khô]</w:t>
+        <w:t xml:space="preserve">[Bối cảnh &amp; Dữ liệu: Áp suất tác dụng lên thợ lặn ở các độ sâu khác nhau (Khối lượng riêng nước biển d = 10300 N/m3)]</w:t>
       </w:r>
     </w:p>
     <w:p>
@@ -2144,7 +2144,7 @@
           <w:sz w:val="20"/>
           <w:szCs w:val="20"/>
         </w:rPr>
-        <w:t xml:space="preserve">[Bối cảnh &amp; Dữ liệu: Bảng theo dõi các chỉ số sinh lí của học sinh Nam (14 tuổi) trong tiết Thể dục]</w:t>
+        <w:t xml:space="preserve">[Bối cảnh &amp; Dữ liệu: Diễn biến độ mặn (gam muối / lít nước) tại trạm đo sông Hàm Luông theo các tháng mùa khô]</w:t>
       </w:r>
     </w:p>
     <w:p>
@@ -2260,7 +2260,7 @@
           <w:sz w:val="20"/>
           <w:szCs w:val="20"/>
         </w:rPr>
-        <w:t xml:space="preserve">[Bối cảnh &amp; Dữ liệu: Áp suất tác dụng lên thợ lặn ở các độ sâu khác nhau (Khối lượng riêng nước biển d = 10300 N/m3)]</w:t>
+        <w:t xml:space="preserve">[Bối cảnh &amp; Dữ liệu: Bảng theo dõi các chỉ số sinh lí của học sinh Nam (14 tuổi) trong tiết Thể dục]</w:t>
       </w:r>
     </w:p>
     <w:p>

</xml_diff>

<commit_message>
feat(assessment): enforce 100% authentic quantitative practical calculations with units for Part III
</commit_message>
<xml_diff>
--- a/exports/qa-package/03_De_kiem_tra_KHTN8.docx
+++ b/exports/qa-package/03_De_kiem_tra_KHTN8.docx
@@ -787,6 +787,121 @@
           <w:sz w:val="22"/>
           <w:szCs w:val="22"/>
         </w:rPr>
+        <w:t xml:space="preserve">Theo chương trình Khoa học tự nhiên 8, nội dung nào sau đây là đúng khi nói về "Dung dịch và nồng độ dung dịch"?</w:t>
+      </w:r>
+    </w:p>
+    <w:p>
+      <w:pPr>
+        <w:spacing w:after="40"/>
+      </w:pPr>
+      <w:r>
+        <w:rPr>
+          <w:rFonts w:ascii="Times New Roman" w:cs="Times New Roman" w:eastAsia="Times New Roman" w:hAnsi="Times New Roman"/>
+          <w:b/>
+          <w:bCs/>
+          <w:sz w:val="22"/>
+          <w:szCs w:val="22"/>
+        </w:rPr>
+        <w:t xml:space="preserve">   A. </w:t>
+      </w:r>
+      <w:r>
+        <w:rPr>
+          <w:rFonts w:ascii="Times New Roman" w:cs="Times New Roman" w:eastAsia="Times New Roman" w:hAnsi="Times New Roman"/>
+          <w:sz w:val="22"/>
+          <w:szCs w:val="22"/>
+        </w:rPr>
+        <w:t xml:space="preserve">Dung dịch và nồng độ dung dịch</w:t>
+      </w:r>
+    </w:p>
+    <w:p>
+      <w:pPr>
+        <w:spacing w:after="40"/>
+      </w:pPr>
+      <w:r>
+        <w:rPr>
+          <w:rFonts w:ascii="Times New Roman" w:cs="Times New Roman" w:eastAsia="Times New Roman" w:hAnsi="Times New Roman"/>
+          <w:b/>
+          <w:bCs/>
+          <w:sz w:val="22"/>
+          <w:szCs w:val="22"/>
+        </w:rPr>
+        <w:t xml:space="preserve">   B. </w:t>
+      </w:r>
+      <w:r>
+        <w:rPr>
+          <w:rFonts w:ascii="Times New Roman" w:cs="Times New Roman" w:eastAsia="Times New Roman" w:hAnsi="Times New Roman"/>
+          <w:sz w:val="22"/>
+          <w:szCs w:val="22"/>
+        </w:rPr>
+        <w:t xml:space="preserve">Quá trình diễn ra độc lập và không tuân theo các định luật bảo toàn của tự nhiên.</w:t>
+      </w:r>
+    </w:p>
+    <w:p>
+      <w:pPr>
+        <w:spacing w:after="40"/>
+      </w:pPr>
+      <w:r>
+        <w:rPr>
+          <w:rFonts w:ascii="Times New Roman" w:cs="Times New Roman" w:eastAsia="Times New Roman" w:hAnsi="Times New Roman"/>
+          <w:b/>
+          <w:bCs/>
+          <w:sz w:val="22"/>
+          <w:szCs w:val="22"/>
+        </w:rPr>
+        <w:t xml:space="preserve">   C. </w:t>
+      </w:r>
+      <w:r>
+        <w:rPr>
+          <w:rFonts w:ascii="Times New Roman" w:cs="Times New Roman" w:eastAsia="Times New Roman" w:hAnsi="Times New Roman"/>
+          <w:sz w:val="22"/>
+          <w:szCs w:val="22"/>
+        </w:rPr>
+        <w:t xml:space="preserve">Hiện tượng xảy ra ngẫu nhiên và không chịu sự chi phối của các yếu tố môi trường.</w:t>
+      </w:r>
+    </w:p>
+    <w:p>
+      <w:pPr>
+        <w:spacing w:after="40"/>
+      </w:pPr>
+      <w:r>
+        <w:rPr>
+          <w:rFonts w:ascii="Times New Roman" w:cs="Times New Roman" w:eastAsia="Times New Roman" w:hAnsi="Times New Roman"/>
+          <w:b/>
+          <w:bCs/>
+          <w:sz w:val="22"/>
+          <w:szCs w:val="22"/>
+        </w:rPr>
+        <w:t xml:space="preserve">   D. </w:t>
+      </w:r>
+      <w:r>
+        <w:rPr>
+          <w:rFonts w:ascii="Times New Roman" w:cs="Times New Roman" w:eastAsia="Times New Roman" w:hAnsi="Times New Roman"/>
+          <w:sz w:val="22"/>
+          <w:szCs w:val="22"/>
+        </w:rPr>
+        <w:t xml:space="preserve">Kết quả khảo sát không thể kiểm chứng lại bằng các phương pháp thực nghiệm khoa học.</w:t>
+      </w:r>
+    </w:p>
+    <w:p>
+      <w:pPr>
+        <w:spacing w:after="80" w:before="120"/>
+      </w:pPr>
+      <w:r>
+        <w:rPr>
+          <w:rFonts w:ascii="Times New Roman" w:cs="Times New Roman" w:eastAsia="Times New Roman" w:hAnsi="Times New Roman"/>
+          <w:b/>
+          <w:bCs/>
+          <w:sz w:val="22"/>
+          <w:szCs w:val="22"/>
+        </w:rPr>
+        <w:t xml:space="preserve">Câu 8. </w:t>
+      </w:r>
+      <w:r>
+        <w:rPr>
+          <w:rFonts w:ascii="Times New Roman" w:cs="Times New Roman" w:eastAsia="Times New Roman" w:hAnsi="Times New Roman"/>
+          <w:sz w:val="22"/>
+          <w:szCs w:val="22"/>
+        </w:rPr>
         <w:t xml:space="preserve">Chất khí nào chiếm tỉ lệ thể tích lớn nhất trong thành phần không khí khô (khoảng 78%)?</w:t>
       </w:r>
     </w:p>
@@ -894,15 +1009,15 @@
           <w:sz w:val="22"/>
           <w:szCs w:val="22"/>
         </w:rPr>
-        <w:t xml:space="preserve">Câu 8. </w:t>
-      </w:r>
-      <w:r>
-        <w:rPr>
-          <w:rFonts w:ascii="Times New Roman" w:cs="Times New Roman" w:eastAsia="Times New Roman" w:hAnsi="Times New Roman"/>
-          <w:sz w:val="22"/>
-          <w:szCs w:val="22"/>
-        </w:rPr>
-        <w:t xml:space="preserve">Chất khí nào chiếm tỉ lệ thể tích lớn nhất trong thành phần không khí khô (khoảng 78%)?</w:t>
+        <w:t xml:space="preserve">Câu 9. </w:t>
+      </w:r>
+      <w:r>
+        <w:rPr>
+          <w:rFonts w:ascii="Times New Roman" w:cs="Times New Roman" w:eastAsia="Times New Roman" w:hAnsi="Times New Roman"/>
+          <w:sz w:val="22"/>
+          <w:szCs w:val="22"/>
+        </w:rPr>
+        <w:t xml:space="preserve">Đơn vị đo khối lượng hợp pháp trong hệ thống đo lường của nước ta (SI) là</w:t>
       </w:r>
     </w:p>
     <w:p>
@@ -925,7 +1040,7 @@
           <w:sz w:val="22"/>
           <w:szCs w:val="22"/>
         </w:rPr>
-        <w:t xml:space="preserve">Khí oxygen.</w:t>
+        <w:t xml:space="preserve">gam (g).</w:t>
       </w:r>
     </w:p>
     <w:p>
@@ -948,7 +1063,7 @@
           <w:sz w:val="22"/>
           <w:szCs w:val="22"/>
         </w:rPr>
-        <w:t xml:space="preserve">Khí nitrogen.</w:t>
+        <w:t xml:space="preserve">kilôgam (kg).</w:t>
       </w:r>
     </w:p>
     <w:p>
@@ -971,7 +1086,7 @@
           <w:sz w:val="22"/>
           <w:szCs w:val="22"/>
         </w:rPr>
-        <w:t xml:space="preserve">Khí carbon dioxide.</w:t>
+        <w:t xml:space="preserve">tấn (t).</w:t>
       </w:r>
     </w:p>
     <w:p>
@@ -994,7 +1109,7 @@
           <w:sz w:val="22"/>
           <w:szCs w:val="22"/>
         </w:rPr>
-        <w:t xml:space="preserve">Khí hydrogen.</w:t>
+        <w:t xml:space="preserve">tạ.</w:t>
       </w:r>
     </w:p>
     <w:p>
@@ -1009,7 +1124,122 @@
           <w:sz w:val="22"/>
           <w:szCs w:val="22"/>
         </w:rPr>
-        <w:t xml:space="preserve">Câu 9. </w:t>
+        <w:t xml:space="preserve">Câu 10. </w:t>
+      </w:r>
+      <w:r>
+        <w:rPr>
+          <w:rFonts w:ascii="Times New Roman" w:cs="Times New Roman" w:eastAsia="Times New Roman" w:hAnsi="Times New Roman"/>
+          <w:sz w:val="22"/>
+          <w:szCs w:val="22"/>
+        </w:rPr>
+        <w:t xml:space="preserve">Đơn vị đo khối lượng hợp pháp trong hệ thống đo lường của nước ta (SI) là</w:t>
+      </w:r>
+    </w:p>
+    <w:p>
+      <w:pPr>
+        <w:spacing w:after="40"/>
+      </w:pPr>
+      <w:r>
+        <w:rPr>
+          <w:rFonts w:ascii="Times New Roman" w:cs="Times New Roman" w:eastAsia="Times New Roman" w:hAnsi="Times New Roman"/>
+          <w:b/>
+          <w:bCs/>
+          <w:sz w:val="22"/>
+          <w:szCs w:val="22"/>
+        </w:rPr>
+        <w:t xml:space="preserve">   A. </w:t>
+      </w:r>
+      <w:r>
+        <w:rPr>
+          <w:rFonts w:ascii="Times New Roman" w:cs="Times New Roman" w:eastAsia="Times New Roman" w:hAnsi="Times New Roman"/>
+          <w:sz w:val="22"/>
+          <w:szCs w:val="22"/>
+        </w:rPr>
+        <w:t xml:space="preserve">gam (g).</w:t>
+      </w:r>
+    </w:p>
+    <w:p>
+      <w:pPr>
+        <w:spacing w:after="40"/>
+      </w:pPr>
+      <w:r>
+        <w:rPr>
+          <w:rFonts w:ascii="Times New Roman" w:cs="Times New Roman" w:eastAsia="Times New Roman" w:hAnsi="Times New Roman"/>
+          <w:b/>
+          <w:bCs/>
+          <w:sz w:val="22"/>
+          <w:szCs w:val="22"/>
+        </w:rPr>
+        <w:t xml:space="preserve">   B. </w:t>
+      </w:r>
+      <w:r>
+        <w:rPr>
+          <w:rFonts w:ascii="Times New Roman" w:cs="Times New Roman" w:eastAsia="Times New Roman" w:hAnsi="Times New Roman"/>
+          <w:sz w:val="22"/>
+          <w:szCs w:val="22"/>
+        </w:rPr>
+        <w:t xml:space="preserve">kilôgam (kg).</w:t>
+      </w:r>
+    </w:p>
+    <w:p>
+      <w:pPr>
+        <w:spacing w:after="40"/>
+      </w:pPr>
+      <w:r>
+        <w:rPr>
+          <w:rFonts w:ascii="Times New Roman" w:cs="Times New Roman" w:eastAsia="Times New Roman" w:hAnsi="Times New Roman"/>
+          <w:b/>
+          <w:bCs/>
+          <w:sz w:val="22"/>
+          <w:szCs w:val="22"/>
+        </w:rPr>
+        <w:t xml:space="preserve">   C. </w:t>
+      </w:r>
+      <w:r>
+        <w:rPr>
+          <w:rFonts w:ascii="Times New Roman" w:cs="Times New Roman" w:eastAsia="Times New Roman" w:hAnsi="Times New Roman"/>
+          <w:sz w:val="22"/>
+          <w:szCs w:val="22"/>
+        </w:rPr>
+        <w:t xml:space="preserve">tấn (t).</w:t>
+      </w:r>
+    </w:p>
+    <w:p>
+      <w:pPr>
+        <w:spacing w:after="40"/>
+      </w:pPr>
+      <w:r>
+        <w:rPr>
+          <w:rFonts w:ascii="Times New Roman" w:cs="Times New Roman" w:eastAsia="Times New Roman" w:hAnsi="Times New Roman"/>
+          <w:b/>
+          <w:bCs/>
+          <w:sz w:val="22"/>
+          <w:szCs w:val="22"/>
+        </w:rPr>
+        <w:t xml:space="preserve">   D. </w:t>
+      </w:r>
+      <w:r>
+        <w:rPr>
+          <w:rFonts w:ascii="Times New Roman" w:cs="Times New Roman" w:eastAsia="Times New Roman" w:hAnsi="Times New Roman"/>
+          <w:sz w:val="22"/>
+          <w:szCs w:val="22"/>
+        </w:rPr>
+        <w:t xml:space="preserve">tạ.</w:t>
+      </w:r>
+    </w:p>
+    <w:p>
+      <w:pPr>
+        <w:spacing w:after="80" w:before="120"/>
+      </w:pPr>
+      <w:r>
+        <w:rPr>
+          <w:rFonts w:ascii="Times New Roman" w:cs="Times New Roman" w:eastAsia="Times New Roman" w:hAnsi="Times New Roman"/>
+          <w:b/>
+          <w:bCs/>
+          <w:sz w:val="22"/>
+          <w:szCs w:val="22"/>
+        </w:rPr>
+        <w:t xml:space="preserve">Câu 11. </w:t>
       </w:r>
       <w:r>
         <w:rPr>
@@ -1110,236 +1340,6 @@
           <w:szCs w:val="22"/>
         </w:rPr>
         <w:t xml:space="preserve">Kết quả khảo sát không thể kiểm chứng lại bằng các phương pháp thực nghiệm khoa học.</w:t>
-      </w:r>
-    </w:p>
-    <w:p>
-      <w:pPr>
-        <w:spacing w:after="80" w:before="120"/>
-      </w:pPr>
-      <w:r>
-        <w:rPr>
-          <w:rFonts w:ascii="Times New Roman" w:cs="Times New Roman" w:eastAsia="Times New Roman" w:hAnsi="Times New Roman"/>
-          <w:b/>
-          <w:bCs/>
-          <w:sz w:val="22"/>
-          <w:szCs w:val="22"/>
-        </w:rPr>
-        <w:t xml:space="preserve">Câu 10. </w:t>
-      </w:r>
-      <w:r>
-        <w:rPr>
-          <w:rFonts w:ascii="Times New Roman" w:cs="Times New Roman" w:eastAsia="Times New Roman" w:hAnsi="Times New Roman"/>
-          <w:sz w:val="22"/>
-          <w:szCs w:val="22"/>
-        </w:rPr>
-        <w:t xml:space="preserve">Đơn vị đo khối lượng hợp pháp trong hệ thống đo lường của nước ta (SI) là</w:t>
-      </w:r>
-    </w:p>
-    <w:p>
-      <w:pPr>
-        <w:spacing w:after="40"/>
-      </w:pPr>
-      <w:r>
-        <w:rPr>
-          <w:rFonts w:ascii="Times New Roman" w:cs="Times New Roman" w:eastAsia="Times New Roman" w:hAnsi="Times New Roman"/>
-          <w:b/>
-          <w:bCs/>
-          <w:sz w:val="22"/>
-          <w:szCs w:val="22"/>
-        </w:rPr>
-        <w:t xml:space="preserve">   A. </w:t>
-      </w:r>
-      <w:r>
-        <w:rPr>
-          <w:rFonts w:ascii="Times New Roman" w:cs="Times New Roman" w:eastAsia="Times New Roman" w:hAnsi="Times New Roman"/>
-          <w:sz w:val="22"/>
-          <w:szCs w:val="22"/>
-        </w:rPr>
-        <w:t xml:space="preserve">gam (g).</w:t>
-      </w:r>
-    </w:p>
-    <w:p>
-      <w:pPr>
-        <w:spacing w:after="40"/>
-      </w:pPr>
-      <w:r>
-        <w:rPr>
-          <w:rFonts w:ascii="Times New Roman" w:cs="Times New Roman" w:eastAsia="Times New Roman" w:hAnsi="Times New Roman"/>
-          <w:b/>
-          <w:bCs/>
-          <w:sz w:val="22"/>
-          <w:szCs w:val="22"/>
-        </w:rPr>
-        <w:t xml:space="preserve">   B. </w:t>
-      </w:r>
-      <w:r>
-        <w:rPr>
-          <w:rFonts w:ascii="Times New Roman" w:cs="Times New Roman" w:eastAsia="Times New Roman" w:hAnsi="Times New Roman"/>
-          <w:sz w:val="22"/>
-          <w:szCs w:val="22"/>
-        </w:rPr>
-        <w:t xml:space="preserve">kilôgam (kg).</w:t>
-      </w:r>
-    </w:p>
-    <w:p>
-      <w:pPr>
-        <w:spacing w:after="40"/>
-      </w:pPr>
-      <w:r>
-        <w:rPr>
-          <w:rFonts w:ascii="Times New Roman" w:cs="Times New Roman" w:eastAsia="Times New Roman" w:hAnsi="Times New Roman"/>
-          <w:b/>
-          <w:bCs/>
-          <w:sz w:val="22"/>
-          <w:szCs w:val="22"/>
-        </w:rPr>
-        <w:t xml:space="preserve">   C. </w:t>
-      </w:r>
-      <w:r>
-        <w:rPr>
-          <w:rFonts w:ascii="Times New Roman" w:cs="Times New Roman" w:eastAsia="Times New Roman" w:hAnsi="Times New Roman"/>
-          <w:sz w:val="22"/>
-          <w:szCs w:val="22"/>
-        </w:rPr>
-        <w:t xml:space="preserve">tấn (t).</w:t>
-      </w:r>
-    </w:p>
-    <w:p>
-      <w:pPr>
-        <w:spacing w:after="40"/>
-      </w:pPr>
-      <w:r>
-        <w:rPr>
-          <w:rFonts w:ascii="Times New Roman" w:cs="Times New Roman" w:eastAsia="Times New Roman" w:hAnsi="Times New Roman"/>
-          <w:b/>
-          <w:bCs/>
-          <w:sz w:val="22"/>
-          <w:szCs w:val="22"/>
-        </w:rPr>
-        <w:t xml:space="preserve">   D. </w:t>
-      </w:r>
-      <w:r>
-        <w:rPr>
-          <w:rFonts w:ascii="Times New Roman" w:cs="Times New Roman" w:eastAsia="Times New Roman" w:hAnsi="Times New Roman"/>
-          <w:sz w:val="22"/>
-          <w:szCs w:val="22"/>
-        </w:rPr>
-        <w:t xml:space="preserve">tạ.</w:t>
-      </w:r>
-    </w:p>
-    <w:p>
-      <w:pPr>
-        <w:spacing w:after="80" w:before="120"/>
-      </w:pPr>
-      <w:r>
-        <w:rPr>
-          <w:rFonts w:ascii="Times New Roman" w:cs="Times New Roman" w:eastAsia="Times New Roman" w:hAnsi="Times New Roman"/>
-          <w:b/>
-          <w:bCs/>
-          <w:sz w:val="22"/>
-          <w:szCs w:val="22"/>
-        </w:rPr>
-        <w:t xml:space="preserve">Câu 11. </w:t>
-      </w:r>
-      <w:r>
-        <w:rPr>
-          <w:rFonts w:ascii="Times New Roman" w:cs="Times New Roman" w:eastAsia="Times New Roman" w:hAnsi="Times New Roman"/>
-          <w:sz w:val="22"/>
-          <w:szCs w:val="22"/>
-        </w:rPr>
-        <w:t xml:space="preserve">Đơn vị đo khối lượng hợp pháp trong hệ thống đo lường của nước ta (SI) là</w:t>
-      </w:r>
-    </w:p>
-    <w:p>
-      <w:pPr>
-        <w:spacing w:after="40"/>
-      </w:pPr>
-      <w:r>
-        <w:rPr>
-          <w:rFonts w:ascii="Times New Roman" w:cs="Times New Roman" w:eastAsia="Times New Roman" w:hAnsi="Times New Roman"/>
-          <w:b/>
-          <w:bCs/>
-          <w:sz w:val="22"/>
-          <w:szCs w:val="22"/>
-        </w:rPr>
-        <w:t xml:space="preserve">   A. </w:t>
-      </w:r>
-      <w:r>
-        <w:rPr>
-          <w:rFonts w:ascii="Times New Roman" w:cs="Times New Roman" w:eastAsia="Times New Roman" w:hAnsi="Times New Roman"/>
-          <w:sz w:val="22"/>
-          <w:szCs w:val="22"/>
-        </w:rPr>
-        <w:t xml:space="preserve">gam (g).</w:t>
-      </w:r>
-    </w:p>
-    <w:p>
-      <w:pPr>
-        <w:spacing w:after="40"/>
-      </w:pPr>
-      <w:r>
-        <w:rPr>
-          <w:rFonts w:ascii="Times New Roman" w:cs="Times New Roman" w:eastAsia="Times New Roman" w:hAnsi="Times New Roman"/>
-          <w:b/>
-          <w:bCs/>
-          <w:sz w:val="22"/>
-          <w:szCs w:val="22"/>
-        </w:rPr>
-        <w:t xml:space="preserve">   B. </w:t>
-      </w:r>
-      <w:r>
-        <w:rPr>
-          <w:rFonts w:ascii="Times New Roman" w:cs="Times New Roman" w:eastAsia="Times New Roman" w:hAnsi="Times New Roman"/>
-          <w:sz w:val="22"/>
-          <w:szCs w:val="22"/>
-        </w:rPr>
-        <w:t xml:space="preserve">kilôgam (kg).</w:t>
-      </w:r>
-    </w:p>
-    <w:p>
-      <w:pPr>
-        <w:spacing w:after="40"/>
-      </w:pPr>
-      <w:r>
-        <w:rPr>
-          <w:rFonts w:ascii="Times New Roman" w:cs="Times New Roman" w:eastAsia="Times New Roman" w:hAnsi="Times New Roman"/>
-          <w:b/>
-          <w:bCs/>
-          <w:sz w:val="22"/>
-          <w:szCs w:val="22"/>
-        </w:rPr>
-        <w:t xml:space="preserve">   C. </w:t>
-      </w:r>
-      <w:r>
-        <w:rPr>
-          <w:rFonts w:ascii="Times New Roman" w:cs="Times New Roman" w:eastAsia="Times New Roman" w:hAnsi="Times New Roman"/>
-          <w:sz w:val="22"/>
-          <w:szCs w:val="22"/>
-        </w:rPr>
-        <w:t xml:space="preserve">tấn (t).</w:t>
-      </w:r>
-    </w:p>
-    <w:p>
-      <w:pPr>
-        <w:spacing w:after="40"/>
-      </w:pPr>
-      <w:r>
-        <w:rPr>
-          <w:rFonts w:ascii="Times New Roman" w:cs="Times New Roman" w:eastAsia="Times New Roman" w:hAnsi="Times New Roman"/>
-          <w:b/>
-          <w:bCs/>
-          <w:sz w:val="22"/>
-          <w:szCs w:val="22"/>
-        </w:rPr>
-        <w:t xml:space="preserve">   D. </w:t>
-      </w:r>
-      <w:r>
-        <w:rPr>
-          <w:rFonts w:ascii="Times New Roman" w:cs="Times New Roman" w:eastAsia="Times New Roman" w:hAnsi="Times New Roman"/>
-          <w:sz w:val="22"/>
-          <w:szCs w:val="22"/>
-        </w:rPr>
-        <w:t xml:space="preserve">tạ.</w:t>
       </w:r>
     </w:p>
     <w:p>
@@ -2810,7 +2810,7 @@
           <w:sz w:val="20"/>
           <w:szCs w:val="20"/>
         </w:rPr>
-        <w:t xml:space="preserve">Thí sinh trả lời từ câu 17 đến câu 19. Điền câu trả lời ngắn gọn (thuật ngữ, tên chất hoặc kết quả tính toán). Mỗi câu trả lời đúng được 0.5 điểm.</w:t>
+        <w:t xml:space="preserve">Thí sinh trả lời từ câu 17 đến câu 19. Viết con số kết quả tính toán (kèm đơn vị đo quy định) vào ô trả lời. Mỗi câu trả lời đúng được 0.5 điểm.</w:t>
       </w:r>
     </w:p>
     <w:p>

</xml_diff>

<commit_message>
feat(test-generator): support 50% Bank + 50% AI hybrid generation with auto-save to question bank
</commit_message>
<xml_diff>
--- a/exports/qa-package/03_De_kiem_tra_KHTN8.docx
+++ b/exports/qa-package/03_De_kiem_tra_KHTN8.docx
@@ -327,6 +327,121 @@
           <w:sz w:val="22"/>
           <w:szCs w:val="22"/>
         </w:rPr>
+        <w:t xml:space="preserve">Dung dịch có giá trị pH nào sau đây làm đổi màu giấy quỳ tím sang màu đỏ?</w:t>
+      </w:r>
+    </w:p>
+    <w:p>
+      <w:pPr>
+        <w:spacing w:after="40"/>
+      </w:pPr>
+      <w:r>
+        <w:rPr>
+          <w:rFonts w:ascii="Times New Roman" w:cs="Times New Roman" w:eastAsia="Times New Roman" w:hAnsi="Times New Roman"/>
+          <w:b/>
+          <w:bCs/>
+          <w:sz w:val="22"/>
+          <w:szCs w:val="22"/>
+        </w:rPr>
+        <w:t xml:space="preserve">   A. </w:t>
+      </w:r>
+      <w:r>
+        <w:rPr>
+          <w:rFonts w:ascii="Times New Roman" w:cs="Times New Roman" w:eastAsia="Times New Roman" w:hAnsi="Times New Roman"/>
+          <w:sz w:val="22"/>
+          <w:szCs w:val="22"/>
+        </w:rPr>
+        <w:t xml:space="preserve">pH = 7 (nước cất).</w:t>
+      </w:r>
+    </w:p>
+    <w:p>
+      <w:pPr>
+        <w:spacing w:after="40"/>
+      </w:pPr>
+      <w:r>
+        <w:rPr>
+          <w:rFonts w:ascii="Times New Roman" w:cs="Times New Roman" w:eastAsia="Times New Roman" w:hAnsi="Times New Roman"/>
+          <w:b/>
+          <w:bCs/>
+          <w:sz w:val="22"/>
+          <w:szCs w:val="22"/>
+        </w:rPr>
+        <w:t xml:space="preserve">   B. </w:t>
+      </w:r>
+      <w:r>
+        <w:rPr>
+          <w:rFonts w:ascii="Times New Roman" w:cs="Times New Roman" w:eastAsia="Times New Roman" w:hAnsi="Times New Roman"/>
+          <w:sz w:val="22"/>
+          <w:szCs w:val="22"/>
+        </w:rPr>
+        <w:t xml:space="preserve">pH = 3 (dung dịch acid).</w:t>
+      </w:r>
+    </w:p>
+    <w:p>
+      <w:pPr>
+        <w:spacing w:after="40"/>
+      </w:pPr>
+      <w:r>
+        <w:rPr>
+          <w:rFonts w:ascii="Times New Roman" w:cs="Times New Roman" w:eastAsia="Times New Roman" w:hAnsi="Times New Roman"/>
+          <w:b/>
+          <w:bCs/>
+          <w:sz w:val="22"/>
+          <w:szCs w:val="22"/>
+        </w:rPr>
+        <w:t xml:space="preserve">   C. </w:t>
+      </w:r>
+      <w:r>
+        <w:rPr>
+          <w:rFonts w:ascii="Times New Roman" w:cs="Times New Roman" w:eastAsia="Times New Roman" w:hAnsi="Times New Roman"/>
+          <w:sz w:val="22"/>
+          <w:szCs w:val="22"/>
+        </w:rPr>
+        <w:t xml:space="preserve">pH = 9 (dung dịch base).</w:t>
+      </w:r>
+    </w:p>
+    <w:p>
+      <w:pPr>
+        <w:spacing w:after="40"/>
+      </w:pPr>
+      <w:r>
+        <w:rPr>
+          <w:rFonts w:ascii="Times New Roman" w:cs="Times New Roman" w:eastAsia="Times New Roman" w:hAnsi="Times New Roman"/>
+          <w:b/>
+          <w:bCs/>
+          <w:sz w:val="22"/>
+          <w:szCs w:val="22"/>
+        </w:rPr>
+        <w:t xml:space="preserve">   D. </w:t>
+      </w:r>
+      <w:r>
+        <w:rPr>
+          <w:rFonts w:ascii="Times New Roman" w:cs="Times New Roman" w:eastAsia="Times New Roman" w:hAnsi="Times New Roman"/>
+          <w:sz w:val="22"/>
+          <w:szCs w:val="22"/>
+        </w:rPr>
+        <w:t xml:space="preserve">pH = 12 (nước vôi trong).</w:t>
+      </w:r>
+    </w:p>
+    <w:p>
+      <w:pPr>
+        <w:spacing w:after="80" w:before="120"/>
+      </w:pPr>
+      <w:r>
+        <w:rPr>
+          <w:rFonts w:ascii="Times New Roman" w:cs="Times New Roman" w:eastAsia="Times New Roman" w:hAnsi="Times New Roman"/>
+          <w:b/>
+          <w:bCs/>
+          <w:sz w:val="22"/>
+          <w:szCs w:val="22"/>
+        </w:rPr>
+        <w:t xml:space="preserve">Câu 4. </w:t>
+      </w:r>
+      <w:r>
+        <w:rPr>
+          <w:rFonts w:ascii="Times New Roman" w:cs="Times New Roman" w:eastAsia="Times New Roman" w:hAnsi="Times New Roman"/>
+          <w:sz w:val="22"/>
+          <w:szCs w:val="22"/>
+        </w:rPr>
         <w:t xml:space="preserve">Theo chương trình Khoa học tự nhiên 8, nội dung nào sau đây là đúng khi nói về "Phản ứng hóa học"?</w:t>
       </w:r>
     </w:p>
@@ -434,15 +549,15 @@
           <w:sz w:val="22"/>
           <w:szCs w:val="22"/>
         </w:rPr>
-        <w:t xml:space="preserve">Câu 4. </w:t>
-      </w:r>
-      <w:r>
-        <w:rPr>
-          <w:rFonts w:ascii="Times New Roman" w:cs="Times New Roman" w:eastAsia="Times New Roman" w:hAnsi="Times New Roman"/>
-          <w:sz w:val="22"/>
-          <w:szCs w:val="22"/>
-        </w:rPr>
-        <w:t xml:space="preserve">Dung dịch có giá trị pH nào sau đây làm đổi màu giấy quỳ tím sang màu đỏ?</w:t>
+        <w:t xml:space="preserve">Câu 5. </w:t>
+      </w:r>
+      <w:r>
+        <w:rPr>
+          <w:rFonts w:ascii="Times New Roman" w:cs="Times New Roman" w:eastAsia="Times New Roman" w:hAnsi="Times New Roman"/>
+          <w:sz w:val="22"/>
+          <w:szCs w:val="22"/>
+        </w:rPr>
+        <w:t xml:space="preserve">Khí nào chiếm tỉ lệ thể tích lớn nhất trong thành phần không khí khô (khoảng 78%)?</w:t>
       </w:r>
     </w:p>
     <w:p>
@@ -465,7 +580,7 @@
           <w:sz w:val="22"/>
           <w:szCs w:val="22"/>
         </w:rPr>
-        <w:t xml:space="preserve">pH = 7 (nước cất).</w:t>
+        <w:t xml:space="preserve">Khí oxygen.</w:t>
       </w:r>
     </w:p>
     <w:p>
@@ -488,7 +603,7 @@
           <w:sz w:val="22"/>
           <w:szCs w:val="22"/>
         </w:rPr>
-        <w:t xml:space="preserve">pH = 3 (dung dịch acid).</w:t>
+        <w:t xml:space="preserve">Khí nitrogen.</w:t>
       </w:r>
     </w:p>
     <w:p>
@@ -511,7 +626,7 @@
           <w:sz w:val="22"/>
           <w:szCs w:val="22"/>
         </w:rPr>
-        <w:t xml:space="preserve">pH = 9 (dung dịch base).</w:t>
+        <w:t xml:space="preserve">Khí carbon dioxide.</w:t>
       </w:r>
     </w:p>
     <w:p>
@@ -534,7 +649,7 @@
           <w:sz w:val="22"/>
           <w:szCs w:val="22"/>
         </w:rPr>
-        <w:t xml:space="preserve">pH = 12 (nước vôi trong).</w:t>
+        <w:t xml:space="preserve">Hơi nước và các khí hiếm.</w:t>
       </w:r>
     </w:p>
     <w:p>
@@ -549,7 +664,7 @@
           <w:sz w:val="22"/>
           <w:szCs w:val="22"/>
         </w:rPr>
-        <w:t xml:space="preserve">Câu 5. </w:t>
+        <w:t xml:space="preserve">Câu 6. </w:t>
       </w:r>
       <w:r>
         <w:rPr>
@@ -664,15 +779,15 @@
           <w:sz w:val="22"/>
           <w:szCs w:val="22"/>
         </w:rPr>
-        <w:t xml:space="preserve">Câu 6. </w:t>
-      </w:r>
-      <w:r>
-        <w:rPr>
-          <w:rFonts w:ascii="Times New Roman" w:cs="Times New Roman" w:eastAsia="Times New Roman" w:hAnsi="Times New Roman"/>
-          <w:sz w:val="22"/>
-          <w:szCs w:val="22"/>
-        </w:rPr>
-        <w:t xml:space="preserve">Chất khí nào chiếm tỉ lệ thể tích lớn nhất trong thành phần không khí khô (khoảng 78%)?</w:t>
+        <w:t xml:space="preserve">Câu 7. </w:t>
+      </w:r>
+      <w:r>
+        <w:rPr>
+          <w:rFonts w:ascii="Times New Roman" w:cs="Times New Roman" w:eastAsia="Times New Roman" w:hAnsi="Times New Roman"/>
+          <w:sz w:val="22"/>
+          <w:szCs w:val="22"/>
+        </w:rPr>
+        <w:t xml:space="preserve">Theo chương trình Khoa học tự nhiên 8, nội dung nào sau đây là đúng khi nói về "Dung dịch và nồng độ dung dịch"?</w:t>
       </w:r>
     </w:p>
     <w:p>
@@ -695,7 +810,7 @@
           <w:sz w:val="22"/>
           <w:szCs w:val="22"/>
         </w:rPr>
-        <w:t xml:space="preserve">Khí oxygen.</w:t>
+        <w:t xml:space="preserve">Dung dịch và nồng độ dung dịch</w:t>
       </w:r>
     </w:p>
     <w:p>
@@ -718,7 +833,7 @@
           <w:sz w:val="22"/>
           <w:szCs w:val="22"/>
         </w:rPr>
-        <w:t xml:space="preserve">Khí nitrogen.</w:t>
+        <w:t xml:space="preserve">Quá trình diễn ra độc lập và không tuân theo các định luật bảo toàn của tự nhiên.</w:t>
       </w:r>
     </w:p>
     <w:p>
@@ -741,7 +856,7 @@
           <w:sz w:val="22"/>
           <w:szCs w:val="22"/>
         </w:rPr>
-        <w:t xml:space="preserve">Khí carbon dioxide.</w:t>
+        <w:t xml:space="preserve">Hiện tượng xảy ra ngẫu nhiên và không chịu sự chi phối của các yếu tố môi trường.</w:t>
       </w:r>
     </w:p>
     <w:p>
@@ -764,7 +879,7 @@
           <w:sz w:val="22"/>
           <w:szCs w:val="22"/>
         </w:rPr>
-        <w:t xml:space="preserve">Khí hydrogen.</w:t>
+        <w:t xml:space="preserve">Kết quả khảo sát không thể kiểm chứng lại bằng các phương pháp thực nghiệm khoa học.</w:t>
       </w:r>
     </w:p>
     <w:p>
@@ -779,7 +894,7 @@
           <w:sz w:val="22"/>
           <w:szCs w:val="22"/>
         </w:rPr>
-        <w:t xml:space="preserve">Câu 7. </w:t>
+        <w:t xml:space="preserve">Câu 8. </w:t>
       </w:r>
       <w:r>
         <w:rPr>
@@ -894,15 +1009,15 @@
           <w:sz w:val="22"/>
           <w:szCs w:val="22"/>
         </w:rPr>
-        <w:t xml:space="preserve">Câu 8. </w:t>
-      </w:r>
-      <w:r>
-        <w:rPr>
-          <w:rFonts w:ascii="Times New Roman" w:cs="Times New Roman" w:eastAsia="Times New Roman" w:hAnsi="Times New Roman"/>
-          <w:sz w:val="22"/>
-          <w:szCs w:val="22"/>
-        </w:rPr>
-        <w:t xml:space="preserve">Chất khí nào chiếm tỉ lệ thể tích lớn nhất trong thành phần không khí khô (khoảng 78%)?</w:t>
+        <w:t xml:space="preserve">Câu 9. </w:t>
+      </w:r>
+      <w:r>
+        <w:rPr>
+          <w:rFonts w:ascii="Times New Roman" w:cs="Times New Roman" w:eastAsia="Times New Roman" w:hAnsi="Times New Roman"/>
+          <w:sz w:val="22"/>
+          <w:szCs w:val="22"/>
+        </w:rPr>
+        <w:t xml:space="preserve">Theo chương trình Khoa học tự nhiên 8, nội dung nào sau đây là đúng khi nói về "Định luật bảo toàn khối lượng và phương trình hóa học"?</w:t>
       </w:r>
     </w:p>
     <w:p>
@@ -925,7 +1040,7 @@
           <w:sz w:val="22"/>
           <w:szCs w:val="22"/>
         </w:rPr>
-        <w:t xml:space="preserve">Khí oxygen.</w:t>
+        <w:t xml:space="preserve">Định luật bảo toàn khối lượng và phương trình hóa học</w:t>
       </w:r>
     </w:p>
     <w:p>
@@ -948,7 +1063,7 @@
           <w:sz w:val="22"/>
           <w:szCs w:val="22"/>
         </w:rPr>
-        <w:t xml:space="preserve">Khí nitrogen.</w:t>
+        <w:t xml:space="preserve">Quá trình diễn ra độc lập và không tuân theo các định luật bảo toàn của tự nhiên.</w:t>
       </w:r>
     </w:p>
     <w:p>
@@ -971,7 +1086,7 @@
           <w:sz w:val="22"/>
           <w:szCs w:val="22"/>
         </w:rPr>
-        <w:t xml:space="preserve">Khí carbon dioxide.</w:t>
+        <w:t xml:space="preserve">Hiện tượng xảy ra ngẫu nhiên và không chịu sự chi phối của các yếu tố môi trường.</w:t>
       </w:r>
     </w:p>
     <w:p>
@@ -994,7 +1109,7 @@
           <w:sz w:val="22"/>
           <w:szCs w:val="22"/>
         </w:rPr>
-        <w:t xml:space="preserve">Khí hydrogen.</w:t>
+        <w:t xml:space="preserve">Kết quả khảo sát không thể kiểm chứng lại bằng các phương pháp thực nghiệm khoa học.</w:t>
       </w:r>
     </w:p>
     <w:p>
@@ -1009,15 +1124,15 @@
           <w:sz w:val="22"/>
           <w:szCs w:val="22"/>
         </w:rPr>
-        <w:t xml:space="preserve">Câu 9. </w:t>
-      </w:r>
-      <w:r>
-        <w:rPr>
-          <w:rFonts w:ascii="Times New Roman" w:cs="Times New Roman" w:eastAsia="Times New Roman" w:hAnsi="Times New Roman"/>
-          <w:sz w:val="22"/>
-          <w:szCs w:val="22"/>
-        </w:rPr>
-        <w:t xml:space="preserve">Đơn vị đo khối lượng hợp pháp trong hệ thống đo lường của nước ta (SI) là</w:t>
+        <w:t xml:space="preserve">Câu 10. </w:t>
+      </w:r>
+      <w:r>
+        <w:rPr>
+          <w:rFonts w:ascii="Times New Roman" w:cs="Times New Roman" w:eastAsia="Times New Roman" w:hAnsi="Times New Roman"/>
+          <w:sz w:val="22"/>
+          <w:szCs w:val="22"/>
+        </w:rPr>
+        <w:t xml:space="preserve">Theo chương trình Khoa học tự nhiên 8, nội dung nào sau đây là đúng khi nói về "Định luật bảo toàn khối lượng và phương trình hóa học"?</w:t>
       </w:r>
     </w:p>
     <w:p>
@@ -1040,7 +1155,7 @@
           <w:sz w:val="22"/>
           <w:szCs w:val="22"/>
         </w:rPr>
-        <w:t xml:space="preserve">gam (g).</w:t>
+        <w:t xml:space="preserve">Định luật bảo toàn khối lượng và phương trình hóa học</w:t>
       </w:r>
     </w:p>
     <w:p>
@@ -1063,7 +1178,7 @@
           <w:sz w:val="22"/>
           <w:szCs w:val="22"/>
         </w:rPr>
-        <w:t xml:space="preserve">kilôgam (kg).</w:t>
+        <w:t xml:space="preserve">Quá trình diễn ra độc lập và không tuân theo các định luật bảo toàn của tự nhiên.</w:t>
       </w:r>
     </w:p>
     <w:p>
@@ -1086,7 +1201,7 @@
           <w:sz w:val="22"/>
           <w:szCs w:val="22"/>
         </w:rPr>
-        <w:t xml:space="preserve">tấn (t).</w:t>
+        <w:t xml:space="preserve">Hiện tượng xảy ra ngẫu nhiên và không chịu sự chi phối của các yếu tố môi trường.</w:t>
       </w:r>
     </w:p>
     <w:p>
@@ -1109,122 +1224,7 @@
           <w:sz w:val="22"/>
           <w:szCs w:val="22"/>
         </w:rPr>
-        <w:t xml:space="preserve">tạ.</w:t>
-      </w:r>
-    </w:p>
-    <w:p>
-      <w:pPr>
-        <w:spacing w:after="80" w:before="120"/>
-      </w:pPr>
-      <w:r>
-        <w:rPr>
-          <w:rFonts w:ascii="Times New Roman" w:cs="Times New Roman" w:eastAsia="Times New Roman" w:hAnsi="Times New Roman"/>
-          <w:b/>
-          <w:bCs/>
-          <w:sz w:val="22"/>
-          <w:szCs w:val="22"/>
-        </w:rPr>
-        <w:t xml:space="preserve">Câu 10. </w:t>
-      </w:r>
-      <w:r>
-        <w:rPr>
-          <w:rFonts w:ascii="Times New Roman" w:cs="Times New Roman" w:eastAsia="Times New Roman" w:hAnsi="Times New Roman"/>
-          <w:sz w:val="22"/>
-          <w:szCs w:val="22"/>
-        </w:rPr>
-        <w:t xml:space="preserve">Đơn vị đo khối lượng hợp pháp trong hệ thống đo lường của nước ta (SI) là</w:t>
-      </w:r>
-    </w:p>
-    <w:p>
-      <w:pPr>
-        <w:spacing w:after="40"/>
-      </w:pPr>
-      <w:r>
-        <w:rPr>
-          <w:rFonts w:ascii="Times New Roman" w:cs="Times New Roman" w:eastAsia="Times New Roman" w:hAnsi="Times New Roman"/>
-          <w:b/>
-          <w:bCs/>
-          <w:sz w:val="22"/>
-          <w:szCs w:val="22"/>
-        </w:rPr>
-        <w:t xml:space="preserve">   A. </w:t>
-      </w:r>
-      <w:r>
-        <w:rPr>
-          <w:rFonts w:ascii="Times New Roman" w:cs="Times New Roman" w:eastAsia="Times New Roman" w:hAnsi="Times New Roman"/>
-          <w:sz w:val="22"/>
-          <w:szCs w:val="22"/>
-        </w:rPr>
-        <w:t xml:space="preserve">gam (g).</w:t>
-      </w:r>
-    </w:p>
-    <w:p>
-      <w:pPr>
-        <w:spacing w:after="40"/>
-      </w:pPr>
-      <w:r>
-        <w:rPr>
-          <w:rFonts w:ascii="Times New Roman" w:cs="Times New Roman" w:eastAsia="Times New Roman" w:hAnsi="Times New Roman"/>
-          <w:b/>
-          <w:bCs/>
-          <w:sz w:val="22"/>
-          <w:szCs w:val="22"/>
-        </w:rPr>
-        <w:t xml:space="preserve">   B. </w:t>
-      </w:r>
-      <w:r>
-        <w:rPr>
-          <w:rFonts w:ascii="Times New Roman" w:cs="Times New Roman" w:eastAsia="Times New Roman" w:hAnsi="Times New Roman"/>
-          <w:sz w:val="22"/>
-          <w:szCs w:val="22"/>
-        </w:rPr>
-        <w:t xml:space="preserve">kilôgam (kg).</w:t>
-      </w:r>
-    </w:p>
-    <w:p>
-      <w:pPr>
-        <w:spacing w:after="40"/>
-      </w:pPr>
-      <w:r>
-        <w:rPr>
-          <w:rFonts w:ascii="Times New Roman" w:cs="Times New Roman" w:eastAsia="Times New Roman" w:hAnsi="Times New Roman"/>
-          <w:b/>
-          <w:bCs/>
-          <w:sz w:val="22"/>
-          <w:szCs w:val="22"/>
-        </w:rPr>
-        <w:t xml:space="preserve">   C. </w:t>
-      </w:r>
-      <w:r>
-        <w:rPr>
-          <w:rFonts w:ascii="Times New Roman" w:cs="Times New Roman" w:eastAsia="Times New Roman" w:hAnsi="Times New Roman"/>
-          <w:sz w:val="22"/>
-          <w:szCs w:val="22"/>
-        </w:rPr>
-        <w:t xml:space="preserve">tấn (t).</w:t>
-      </w:r>
-    </w:p>
-    <w:p>
-      <w:pPr>
-        <w:spacing w:after="40"/>
-      </w:pPr>
-      <w:r>
-        <w:rPr>
-          <w:rFonts w:ascii="Times New Roman" w:cs="Times New Roman" w:eastAsia="Times New Roman" w:hAnsi="Times New Roman"/>
-          <w:b/>
-          <w:bCs/>
-          <w:sz w:val="22"/>
-          <w:szCs w:val="22"/>
-        </w:rPr>
-        <w:t xml:space="preserve">   D. </w:t>
-      </w:r>
-      <w:r>
-        <w:rPr>
-          <w:rFonts w:ascii="Times New Roman" w:cs="Times New Roman" w:eastAsia="Times New Roman" w:hAnsi="Times New Roman"/>
-          <w:sz w:val="22"/>
-          <w:szCs w:val="22"/>
-        </w:rPr>
-        <w:t xml:space="preserve">tạ.</w:t>
+        <w:t xml:space="preserve">Kết quả khảo sát không thể kiểm chứng lại bằng các phương pháp thực nghiệm khoa học.</w:t>
       </w:r>
     </w:p>
     <w:p>

</xml_diff>